<commit_message>
[ADD] Examples and improve captions.
</commit_message>
<xml_diff>
--- a/src/md_reports/renderers/docx/resources/default_template.docx
+++ b/src/md_reports/renderers/docx/resources/default_template.docx
@@ -1153,26 +1153,6 @@
       <w:szCs w:val="20"/>
     </w:rPr>
   </w:style>
-  <w:style w:type="paragraph" w:styleId="Caption">
-    <w:name w:val="caption"/>
-    <w:basedOn w:val="Normal"/>
-    <w:next w:val="Normal"/>
-    <w:uiPriority w:val="35"/>
-    <w:semiHidden/>
-    <w:unhideWhenUsed/>
-    <w:qFormat/>
-    <w:rsid w:val="00FC693F"/>
-    <w:pPr>
-      <w:spacing w:line="240" w:lineRule="auto"/>
-    </w:pPr>
-    <w:rPr>
-      <w:b/>
-      <w:bCs/>
-      <w:color w:val="4F81BD" w:themeColor="accent1"/>
-      <w:sz w:val="18"/>
-      <w:szCs w:val="18"/>
-    </w:rPr>
-  </w:style>
   <w:style w:type="character" w:styleId="Strong">
     <w:name w:val="Strong"/>
     <w:basedOn w:val="DefaultParagraphFont"/>
@@ -12057,6 +12037,23 @@
         <w:shd w:val="clear" w:color="auto" w:fill="FBCAA2" w:themeFill="accent6" w:themeFillTint="7F"/>
       </w:tcPr>
     </w:tblStylePr>
+  </w:style>
+  <w:style w:type="paragraph" w:styleId="Caption">
+    <w:name w:val="caption"/>
+    <w:basedOn w:val="Normal"/>
+    <w:next w:val="Normal"/>
+    <w:uiPriority w:val="35"/>
+    <w:qFormat/>
+    <w:pPr>
+      <w:spacing w:before="120" w:after="240"/>
+    </w:pPr>
+    <w:rPr>
+      <w:i/>
+      <w:iCs/>
+      <w:color w:val="595959"/>
+      <w:sz w:val="20"/>
+      <w:szCs w:val="20"/>
+    </w:rPr>
   </w:style>
 </w:styles>
 </file>

</xml_diff>